<commit_message>
Travaux : reimport CDC, CCTP (lots 03/04) et DCE lot01 depuis le Drive de reference
Synchronise les documents travaux avec les versions a jour du Drive partage groupe :
- CDC prestations libres / sociaux abordables MUSKA (maj 2026-06)
- CCTP Lot 03 Libre V2, Lot 03 Social/Abordable V2, Lot 04 Platrerie V2
- DCE Lot 01 Maconnerie Pinelia

Co-Authored-By: Claude Opus 4.8 <noreply@anthropic.com>
</commit_message>
<xml_diff>
--- a/files/pro/travaux/cctp-lot03-libre.docx
+++ b/files/pro/travaux/cctp-lot03-libre.docx
@@ -176,7 +176,28 @@
           <w:szCs w:val="20"/>
           <w:rtl w:val="0"/>
         </w:rPr>
-        <w:t xml:space="preserve">Construction d'une résidence de 69 logements répartis sur 2 bâtiments R+2 sur 1 niveau de sous-sol parking et commerces, dont 30 logements en accession libre </w:t>
+        <w:t xml:space="preserve">Construction d'une résidence de 69 logements répartis sur 2 bâtiments R+2 sur 1 niveau de sous-sol parking et commerces, dont 3</w:t>
+      </w:r>
+      <w:r>
+        <w:rPr>
+          <w:i w:val="1"/>
+          <w:iCs w:val="1"/>
+          <w:color w:val="595959"/>
+          <w:rtl w:val="0"/>
+        </w:rPr>
+        <w:t xml:space="preserve">2</w:t>
+      </w:r>
+      <w:r>
+        <w:rPr>
+          <w:rFonts w:ascii="Arial" w:cs="Arial" w:eastAsia="Arial" w:hAnsi="Arial"/>
+          <w:i w:val="1"/>
+          <w:iCs w:val="1"/>
+          <w:color w:val="595959"/>
+          <w:sz w:val="20"/>
+          <w:szCs w:val="20"/>
+          <w:rtl w:val="0"/>
+        </w:rPr>
+        <w:t xml:space="preserve"> logements en accession libre </w:t>
       </w:r>
       <w:r>
         <w:rPr>
@@ -777,6 +798,12 @@
             </w:pPr>
             <w:r>
               <w:rPr>
+                <w:rtl w:val="0"/>
+              </w:rPr>
+              <w:t xml:space="preserve">3</w:t>
+            </w:r>
+            <w:r>
+              <w:rPr>
                 <w:rFonts w:ascii="Arial" w:cs="Arial" w:eastAsia="Arial" w:hAnsi="Arial"/>
                 <w:b w:val="0"/>
                 <w:bCs w:val="0"/>
@@ -787,7 +814,7 @@
                 <w:szCs w:val="20"/>
                 <w:rtl w:val="0"/>
               </w:rPr>
-              <w:t xml:space="preserve">4ᵉ trimestre 202</w:t>
+              <w:t xml:space="preserve">ᵉ trimestre 202</w:t>
             </w:r>
             <w:r>
               <w:rPr>
@@ -1499,7 +1526,22 @@
           <w:szCs w:val="20"/>
           <w:rtl w:val="0"/>
         </w:rPr>
-        <w:t xml:space="preserve">Les choix de prestation (matériaux, marques, formats, finitions) sont intégralement issus du Cahier des Charges « Prestations &amp; équipements — Logements Libres » de la résidence </w:t>
+        <w:t xml:space="preserve">Les choix de prestation (matériaux, marques, formats, finitions) sont intégralement issus du Cahier des Charges « Prestations </w:t>
+      </w:r>
+      <w:r>
+        <w:rPr>
+          <w:rtl w:val="0"/>
+        </w:rPr>
+        <w:t xml:space="preserve">et équipements</w:t>
+      </w:r>
+      <w:r>
+        <w:rPr>
+          <w:rFonts w:ascii="Arial" w:cs="Arial" w:eastAsia="Arial" w:hAnsi="Arial"/>
+          <w:sz w:val="20"/>
+          <w:szCs w:val="20"/>
+          <w:rtl w:val="0"/>
+        </w:rPr>
+        <w:t xml:space="preserve"> — Logements Libres » de la résidence </w:t>
       </w:r>
       <w:r>
         <w:rPr>
@@ -4636,7 +4678,7 @@
       </w:pPr>
       <w:sdt>
         <w:sdtPr>
-          <w:id w:val="1585911699"/>
+          <w:id w:val="644040089"/>
           <w:tag w:val="goog_rdk_0"/>
         </w:sdtPr>
         <w:sdtContent>
@@ -4687,7 +4729,7 @@
       </w:pPr>
       <w:sdt>
         <w:sdtPr>
-          <w:id w:val="-1653235806"/>
+          <w:id w:val="1167210832"/>
           <w:tag w:val="goog_rdk_1"/>
         </w:sdtPr>
         <w:sdtContent>
@@ -4781,7 +4823,7 @@
       </w:pPr>
       <w:sdt>
         <w:sdtPr>
-          <w:id w:val="1778286729"/>
+          <w:id w:val="2057105634"/>
           <w:tag w:val="goog_rdk_2"/>
         </w:sdtPr>
         <w:sdtContent>
@@ -4832,7 +4874,7 @@
       </w:pPr>
       <w:sdt>
         <w:sdtPr>
-          <w:id w:val="-1851324048"/>
+          <w:id w:val="492496579"/>
           <w:tag w:val="goog_rdk_3"/>
         </w:sdtPr>
         <w:sdtContent>
@@ -5865,7 +5907,7 @@
       </w:pPr>
       <w:sdt>
         <w:sdtPr>
-          <w:id w:val="-602344087"/>
+          <w:id w:val="1354608587"/>
           <w:tag w:val="goog_rdk_4"/>
         </w:sdtPr>
         <w:sdtContent>
@@ -5916,7 +5958,7 @@
       </w:pPr>
       <w:sdt>
         <w:sdtPr>
-          <w:id w:val="493509656"/>
+          <w:id w:val="241401265"/>
           <w:tag w:val="goog_rdk_5"/>
         </w:sdtPr>
         <w:sdtContent>
@@ -5967,7 +6009,7 @@
       </w:pPr>
       <w:sdt>
         <w:sdtPr>
-          <w:id w:val="-1286428596"/>
+          <w:id w:val="269436390"/>
           <w:tag w:val="goog_rdk_6"/>
         </w:sdtPr>
         <w:sdtContent>
@@ -6084,7 +6126,7 @@
       </w:pPr>
       <w:sdt>
         <w:sdtPr>
-          <w:id w:val="-1924946259"/>
+          <w:id w:val="1718000766"/>
           <w:tag w:val="goog_rdk_7"/>
         </w:sdtPr>
         <w:sdtContent>
@@ -6135,7 +6177,7 @@
       </w:pPr>
       <w:sdt>
         <w:sdtPr>
-          <w:id w:val="-1319249268"/>
+          <w:id w:val="-1889935819"/>
           <w:tag w:val="goog_rdk_8"/>
         </w:sdtPr>
         <w:sdtContent>
@@ -6186,7 +6228,7 @@
       </w:pPr>
       <w:sdt>
         <w:sdtPr>
-          <w:id w:val="1804012342"/>
+          <w:id w:val="-2143140316"/>
           <w:tag w:val="goog_rdk_9"/>
         </w:sdtPr>
         <w:sdtContent>
@@ -6343,7 +6385,7 @@
       </w:pPr>
       <w:sdt>
         <w:sdtPr>
-          <w:id w:val="-1662792964"/>
+          <w:id w:val="-473266954"/>
           <w:tag w:val="goog_rdk_10"/>
         </w:sdtPr>
         <w:sdtContent>
@@ -6866,7 +6908,7 @@
       </w:pPr>
       <w:sdt>
         <w:sdtPr>
-          <w:id w:val="-346164159"/>
+          <w:id w:val="-1934031342"/>
           <w:tag w:val="goog_rdk_11"/>
         </w:sdtPr>
         <w:sdtContent>
@@ -7129,7 +7171,7 @@
       </w:pPr>
       <w:sdt>
         <w:sdtPr>
-          <w:id w:val="539879133"/>
+          <w:id w:val="-619463513"/>
           <w:tag w:val="goog_rdk_12"/>
         </w:sdtPr>
         <w:sdtContent>
@@ -7345,7 +7387,7 @@
       </w:pPr>
       <w:sdt>
         <w:sdtPr>
-          <w:id w:val="-644799911"/>
+          <w:id w:val="320389337"/>
           <w:tag w:val="goog_rdk_13"/>
         </w:sdtPr>
         <w:sdtContent>
@@ -7372,7 +7414,7 @@
       </w:pPr>
       <w:sdt>
         <w:sdtPr>
-          <w:id w:val="236126259"/>
+          <w:id w:val="-746152003"/>
           <w:tag w:val="goog_rdk_14"/>
         </w:sdtPr>
         <w:sdtContent>
@@ -10449,7 +10491,7 @@
       </w:pPr>
       <w:sdt>
         <w:sdtPr>
-          <w:id w:val="-1084033122"/>
+          <w:id w:val="1785513830"/>
           <w:tag w:val="goog_rdk_15"/>
         </w:sdtPr>
         <w:sdtContent>
@@ -10500,7 +10542,7 @@
       </w:pPr>
       <w:sdt>
         <w:sdtPr>
-          <w:id w:val="704415708"/>
+          <w:id w:val="1842759777"/>
           <w:tag w:val="goog_rdk_16"/>
         </w:sdtPr>
         <w:sdtContent>
@@ -10551,7 +10593,7 @@
       </w:pPr>
       <w:sdt>
         <w:sdtPr>
-          <w:id w:val="-761813005"/>
+          <w:id w:val="1478884815"/>
           <w:tag w:val="goog_rdk_17"/>
         </w:sdtPr>
         <w:sdtContent>
@@ -11058,7 +11100,7 @@
           <w:iCs w:val="1"/>
           <w:rtl w:val="0"/>
         </w:rPr>
-        <w:t xml:space="preserve">70</w:t>
+        <w:t xml:space="preserve">100</w:t>
       </w:r>
       <w:r>
         <w:rPr>
@@ -11397,7 +11439,7 @@
       </w:pPr>
       <w:sdt>
         <w:sdtPr>
-          <w:id w:val="-1164698994"/>
+          <w:id w:val="824078072"/>
           <w:tag w:val="goog_rdk_18"/>
         </w:sdtPr>
         <w:sdtContent>
@@ -11690,7 +11732,7 @@
       </w:pPr>
       <w:sdt>
         <w:sdtPr>
-          <w:id w:val="796863492"/>
+          <w:id w:val="1685925548"/>
           <w:tag w:val="goog_rdk_19"/>
         </w:sdtPr>
         <w:sdtContent>
@@ -12583,7 +12625,7 @@
       </w:pPr>
       <w:sdt>
         <w:sdtPr>
-          <w:id w:val="-521545927"/>
+          <w:id w:val="1977708945"/>
           <w:tag w:val="goog_rdk_20"/>
         </w:sdtPr>
         <w:sdtContent>
@@ -13926,7 +13968,7 @@
       </w:pPr>
       <w:sdt>
         <w:sdtPr>
-          <w:id w:val="2024743685"/>
+          <w:id w:val="746640876"/>
           <w:tag w:val="goog_rdk_21"/>
         </w:sdtPr>
         <w:sdtContent>
@@ -14432,7 +14474,7 @@
       </w:pPr>
       <w:sdt>
         <w:sdtPr>
-          <w:id w:val="1541950891"/>
+          <w:id w:val="121716371"/>
           <w:tag w:val="goog_rdk_22"/>
         </w:sdtPr>
         <w:sdtContent>
@@ -15361,7 +15403,7 @@
       </w:pPr>
       <w:sdt>
         <w:sdtPr>
-          <w:id w:val="-2108097235"/>
+          <w:id w:val="1996555245"/>
           <w:tag w:val="goog_rdk_23"/>
         </w:sdtPr>
         <w:sdtContent>
@@ -16939,7 +16981,7 @@
       </w:pPr>
       <w:sdt>
         <w:sdtPr>
-          <w:id w:val="-2114779772"/>
+          <w:id w:val="-705049062"/>
           <w:tag w:val="goog_rdk_24"/>
         </w:sdtPr>
         <w:sdtContent>
@@ -18031,7 +18073,7 @@
       </w:pPr>
       <w:sdt>
         <w:sdtPr>
-          <w:id w:val="-150266639"/>
+          <w:id w:val="1503731769"/>
           <w:tag w:val="goog_rdk_25"/>
         </w:sdtPr>
         <w:sdtContent>
@@ -18064,7 +18106,7 @@
       </w:pPr>
       <w:sdt>
         <w:sdtPr>
-          <w:id w:val="-1931943923"/>
+          <w:id w:val="-1109711060"/>
           <w:tag w:val="goog_rdk_26"/>
         </w:sdtPr>
         <w:sdtContent>
@@ -18097,7 +18139,7 @@
       </w:pPr>
       <w:sdt>
         <w:sdtPr>
-          <w:id w:val="-1619931800"/>
+          <w:id w:val="-1484740707"/>
           <w:tag w:val="goog_rdk_27"/>
         </w:sdtPr>
         <w:sdtContent>
@@ -18379,7 +18421,7 @@
       </w:pPr>
       <w:sdt>
         <w:sdtPr>
-          <w:id w:val="387176934"/>
+          <w:id w:val="-672392142"/>
           <w:tag w:val="goog_rdk_28"/>
         </w:sdtPr>
         <w:sdtContent>
@@ -18559,7 +18601,7 @@
       </w:pPr>
       <w:sdt>
         <w:sdtPr>
-          <w:id w:val="9908374"/>
+          <w:id w:val="-529975100"/>
           <w:tag w:val="goog_rdk_29"/>
         </w:sdtPr>
         <w:sdtContent>
@@ -19028,7 +19070,7 @@
       </w:r>
       <w:sdt>
         <w:sdtPr>
-          <w:id w:val="-521932237"/>
+          <w:id w:val="-1338099490"/>
           <w:tag w:val="goog_rdk_30"/>
         </w:sdtPr>
         <w:sdtContent>
@@ -19525,7 +19567,7 @@
       </w:pPr>
       <w:sdt>
         <w:sdtPr>
-          <w:id w:val="-1703964568"/>
+          <w:id w:val="662798345"/>
           <w:tag w:val="goog_rdk_31"/>
         </w:sdtPr>
         <w:sdtContent>
@@ -19824,7 +19866,7 @@
       </w:pPr>
       <w:sdt>
         <w:sdtPr>
-          <w:id w:val="-1469367688"/>
+          <w:id w:val="974033899"/>
           <w:tag w:val="goog_rdk_32"/>
         </w:sdtPr>
         <w:sdtContent>
@@ -20029,7 +20071,7 @@
       </w:pPr>
       <w:sdt>
         <w:sdtPr>
-          <w:id w:val="359771153"/>
+          <w:id w:val="-2140546835"/>
           <w:tag w:val="goog_rdk_33"/>
         </w:sdtPr>
         <w:sdtContent>
@@ -20522,7 +20564,7 @@
             </w:pPr>
             <w:sdt>
               <w:sdtPr>
-                <w:id w:val="1573736611"/>
+                <w:id w:val="-1101630048"/>
                 <w:tag w:val="goog_rdk_34"/>
               </w:sdtPr>
               <w:sdtContent>
@@ -20574,7 +20616,7 @@
             </w:pPr>
             <w:sdt>
               <w:sdtPr>
-                <w:id w:val="-405736860"/>
+                <w:id w:val="-627000942"/>
                 <w:tag w:val="goog_rdk_35"/>
               </w:sdtPr>
               <w:sdtContent>
@@ -20674,7 +20716,7 @@
             </w:pPr>
             <w:sdt>
               <w:sdtPr>
-                <w:id w:val="330615751"/>
+                <w:id w:val="-1414919236"/>
                 <w:tag w:val="goog_rdk_36"/>
               </w:sdtPr>
               <w:sdtContent>
@@ -20725,7 +20767,7 @@
             </w:pPr>
             <w:sdt>
               <w:sdtPr>
-                <w:id w:val="1407828019"/>
+                <w:id w:val="-900056256"/>
                 <w:tag w:val="goog_rdk_37"/>
               </w:sdtPr>
               <w:sdtContent>
@@ -20827,7 +20869,7 @@
             </w:pPr>
             <w:sdt>
               <w:sdtPr>
-                <w:id w:val="1371888271"/>
+                <w:id w:val="24288198"/>
                 <w:tag w:val="goog_rdk_38"/>
               </w:sdtPr>
               <w:sdtContent>
@@ -20879,7 +20921,7 @@
             </w:pPr>
             <w:sdt>
               <w:sdtPr>
-                <w:id w:val="1741558021"/>
+                <w:id w:val="1154962204"/>
                 <w:tag w:val="goog_rdk_39"/>
               </w:sdtPr>
               <w:sdtContent>
@@ -20979,7 +21021,7 @@
             </w:pPr>
             <w:sdt>
               <w:sdtPr>
-                <w:id w:val="2041158787"/>
+                <w:id w:val="-1619728090"/>
                 <w:tag w:val="goog_rdk_40"/>
               </w:sdtPr>
               <w:sdtContent>
@@ -21030,7 +21072,7 @@
             </w:pPr>
             <w:sdt>
               <w:sdtPr>
-                <w:id w:val="-874299090"/>
+                <w:id w:val="838767276"/>
                 <w:tag w:val="goog_rdk_41"/>
               </w:sdtPr>
               <w:sdtContent>
@@ -21405,7 +21447,7 @@
             </w:pPr>
             <w:sdt>
               <w:sdtPr>
-                <w:id w:val="-1663568529"/>
+                <w:id w:val="-1804877546"/>
                 <w:tag w:val="goog_rdk_42"/>
               </w:sdtPr>
               <w:sdtContent>
@@ -21549,7 +21591,7 @@
             </w:pPr>
             <w:sdt>
               <w:sdtPr>
-                <w:id w:val="-1972911074"/>
+                <w:id w:val="515997238"/>
                 <w:tag w:val="goog_rdk_43"/>
               </w:sdtPr>
               <w:sdtContent>
@@ -21600,7 +21642,7 @@
             </w:pPr>
             <w:sdt>
               <w:sdtPr>
-                <w:id w:val="-786832940"/>
+                <w:id w:val="1451877411"/>
                 <w:tag w:val="goog_rdk_44"/>
               </w:sdtPr>
               <w:sdtContent>
@@ -22742,7 +22784,7 @@
       </w:pPr>
       <w:sdt>
         <w:sdtPr>
-          <w:id w:val="-2050885580"/>
+          <w:id w:val="553046712"/>
           <w:tag w:val="goog_rdk_45"/>
         </w:sdtPr>
         <w:sdtContent>

</xml_diff>